<commit_message>
fix: hardcode correct WhatsApp fallback in verify page
</commit_message>
<xml_diff>
--- a/AIE-Clothing-Store-Guide.docx
+++ b/AIE-Clothing-Store-Guide.docx
@@ -43,18 +43,6 @@
           <w:sz w:val="20"/>
           <w:szCs w:val="20"/>
         </w:rPr>
-        <w:t xml:space="preserve">This guide covers everything you need to know to run your online store. You do not need to know anything about technology — just follow the steps. Keep this document somewhere safe and refer back to it whenever you need to.</w:t>
-      </w:r>
-    </w:p>
-    <w:p>
-      <w:pPr>
-        <w:spacing w:after="100"/>
-      </w:pPr>
-      <w:r>
-        <w:rPr>
-          <w:sz w:val="20"/>
-          <w:szCs w:val="20"/>
-        </w:rPr>
         <w:t xml:space="preserve">Your store is live at </w:t>
       </w:r>
       <w:r>
@@ -71,7 +59,7 @@
           <w:sz w:val="20"/>
           <w:szCs w:val="20"/>
         </w:rPr>
-        <w:t xml:space="preserve">. Customers can browse your pieces, choose their size, pay online, and you get the money straight into your bank account. Everything else — adding new pieces, seeing orders, contacting customers — you do from your Admin Dashboard.</w:t>
+        <w:t xml:space="preserve">. Customers shop, pay online, and the money goes straight to your bank. Everything — products, orders, customer messages — is managed from your Admin Dashboard.</w:t>
       </w:r>
     </w:p>
     <w:p>
@@ -94,19 +82,7 @@
           <w:sz w:val="28"/>
           <w:szCs w:val="28"/>
         </w:rPr>
-        <w:t xml:space="preserve">SECTION 1 — Your Login Details</w:t>
-      </w:r>
-    </w:p>
-    <w:p>
-      <w:pPr>
-        <w:spacing w:after="100"/>
-      </w:pPr>
-      <w:r>
-        <w:rPr>
-          <w:sz w:val="20"/>
-          <w:szCs w:val="20"/>
-        </w:rPr>
-        <w:t xml:space="preserve">These are the details you need to access and manage your store. Write them down and keep them very safe.</w:t>
+        <w:t xml:space="preserve">SECTION 1 — Login Details</w:t>
       </w:r>
     </w:p>
     <w:p>
@@ -126,7 +102,7 @@
           <w:sz w:val="22"/>
           <w:szCs w:val="22"/>
         </w:rPr>
-        <w:t xml:space="preserve">Admin Dashboard (where you manage the store)</w:t>
+        <w:t xml:space="preserve">Admin Dashboard</w:t>
       </w:r>
     </w:p>
     <w:tbl>
@@ -164,7 +140,7 @@
                 <w:sz w:val="20"/>
                 <w:szCs w:val="20"/>
               </w:rPr>
-              <w:t xml:space="preserve">Website Address</w:t>
+              <w:t xml:space="preserve">Website</w:t>
             </w:r>
           </w:p>
         </w:tc>
@@ -208,7 +184,7 @@
                 <w:sz w:val="20"/>
                 <w:szCs w:val="20"/>
               </w:rPr>
-              <w:t xml:space="preserve">Your Email</w:t>
+              <w:t xml:space="preserve">Email</w:t>
             </w:r>
           </w:p>
         </w:tc>
@@ -252,7 +228,7 @@
                 <w:sz w:val="20"/>
                 <w:szCs w:val="20"/>
               </w:rPr>
-              <w:t xml:space="preserve">Your Password</w:t>
+              <w:t xml:space="preserve">Password</w:t>
             </w:r>
           </w:p>
         </w:tc>
@@ -284,32 +260,6 @@
     <w:p>
       <w:pPr>
         <w:spacing w:after="120"/>
-        <w:ind w:left="360"/>
-      </w:pPr>
-      <w:r>
-        <w:rPr>
-          <w:b/>
-          <w:bCs/>
-          <w:color w:val="C4773B"/>
-          <w:sz w:val="18"/>
-          <w:szCs w:val="18"/>
-        </w:rPr>
-        <w:t xml:space="preserve">Note:  </w:t>
-      </w:r>
-      <w:r>
-        <w:rPr>
-          <w:i/>
-          <w:iCs/>
-          <w:color w:val="666666"/>
-          <w:sz w:val="18"/>
-          <w:szCs w:val="18"/>
-        </w:rPr>
-        <w:t xml:space="preserve">Go to this address on your phone or computer, enter your email and password, and you are in.</w:t>
-      </w:r>
-    </w:p>
-    <w:p>
-      <w:pPr>
-        <w:spacing w:after="120"/>
       </w:pPr>
     </w:p>
     <w:p>
@@ -324,7 +274,7 @@
           <w:sz w:val="22"/>
           <w:szCs w:val="22"/>
         </w:rPr>
-        <w:t xml:space="preserve">Paystack (where your money is collected)</w:t>
+        <w:t xml:space="preserve">Paystack</w:t>
       </w:r>
     </w:p>
     <w:tbl>
@@ -362,7 +312,7 @@
                 <w:sz w:val="20"/>
                 <w:szCs w:val="20"/>
               </w:rPr>
-              <w:t xml:space="preserve">Paystack Website</w:t>
+              <w:t xml:space="preserve">Website</w:t>
             </w:r>
           </w:p>
         </w:tc>
@@ -406,7 +356,7 @@
                 <w:sz w:val="20"/>
                 <w:szCs w:val="20"/>
               </w:rPr>
-              <w:t xml:space="preserve">Login Email</w:t>
+              <w:t xml:space="preserve">Email</w:t>
             </w:r>
           </w:p>
         </w:tc>
@@ -426,7 +376,7 @@
                 <w:sz w:val="20"/>
                 <w:szCs w:val="20"/>
               </w:rPr>
-              <w:t xml:space="preserve">abdulazeezalasa@gmail.com</w:t>
+              <w:t xml:space="preserve">aieuniquethread@gmail.com</w:t>
             </w:r>
           </w:p>
         </w:tc>
@@ -467,10 +417,13 @@
           <w:p>
             <w:r>
               <w:rPr>
-                <w:sz w:val="20"/>
-                <w:szCs w:val="20"/>
-              </w:rPr>
-              <w:t xml:space="preserve">Your Paystack account password</w:t>
+                <w:rFonts w:ascii="Courier New" w:cs="Courier New" w:eastAsia="Courier New" w:hAnsi="Courier New"/>
+                <w:b/>
+                <w:bCs/>
+                <w:sz w:val="20"/>
+                <w:szCs w:val="20"/>
+              </w:rPr>
+              <w:t xml:space="preserve">Aieclothing@32</w:t>
             </w:r>
           </w:p>
         </w:tc>
@@ -499,7 +452,7 @@
           <w:sz w:val="18"/>
           <w:szCs w:val="18"/>
         </w:rPr>
-        <w:t xml:space="preserve">Paystack is the company that collects payment from your customers. Your money sits here until it moves to your bank account — usually the next business day.</w:t>
+        <w:t xml:space="preserve">Payments from customers land here first, then move to your bank account the next business day.</w:t>
       </w:r>
     </w:p>
     <w:p>
@@ -519,7 +472,7 @@
           <w:sz w:val="22"/>
           <w:szCs w:val="22"/>
         </w:rPr>
-        <w:t xml:space="preserve">Resend (the service that sends your emails)</w:t>
+        <w:t xml:space="preserve">Resend (sends order emails automatically — rarely need to log in)</w:t>
       </w:r>
     </w:p>
     <w:tbl>
@@ -557,7 +510,7 @@
                 <w:sz w:val="20"/>
                 <w:szCs w:val="20"/>
               </w:rPr>
-              <w:t xml:space="preserve">Resend Website</w:t>
+              <w:t xml:space="preserve">Website</w:t>
             </w:r>
           </w:p>
         </w:tc>
@@ -621,38 +574,12 @@
                 <w:sz w:val="20"/>
                 <w:szCs w:val="20"/>
               </w:rPr>
-              <w:t xml:space="preserve">Sign in with your Google account</w:t>
+              <w:t xml:space="preserve">Sign in with Google</w:t>
             </w:r>
           </w:p>
         </w:tc>
       </w:tr>
     </w:tbl>
-    <w:p>
-      <w:pPr>
-        <w:spacing w:after="120"/>
-        <w:ind w:left="360"/>
-      </w:pPr>
-      <w:r>
-        <w:rPr>
-          <w:b/>
-          <w:bCs/>
-          <w:color w:val="C4773B"/>
-          <w:sz w:val="18"/>
-          <w:szCs w:val="18"/>
-        </w:rPr>
-        <w:t xml:space="preserve">Note:  </w:t>
-      </w:r>
-      <w:r>
-        <w:rPr>
-          <w:i/>
-          <w:iCs/>
-          <w:color w:val="666666"/>
-          <w:sz w:val="18"/>
-          <w:szCs w:val="18"/>
-        </w:rPr>
-        <w:t xml:space="preserve">You do not need to log into Resend regularly. It works automatically in the background sending order emails.</w:t>
-      </w:r>
-    </w:p>
     <w:p>
       <w:pPr>
         <w:spacing w:after="120"/>
@@ -678,23 +605,6 @@
     </w:p>
     <w:p>
       <w:pPr>
-        <w:spacing w:after="100"/>
-      </w:pPr>
-      <w:r>
-        <w:rPr>
-          <w:sz w:val="20"/>
-          <w:szCs w:val="20"/>
-        </w:rPr>
-        <w:t xml:space="preserve">Here is a simple picture of how your business works now with the online store:</w:t>
-      </w:r>
-    </w:p>
-    <w:p>
-      <w:pPr>
-        <w:spacing w:after="120"/>
-      </w:pPr>
-    </w:p>
-    <w:p>
-      <w:pPr>
         <w:spacing w:after="80"/>
         <w:ind w:left="360"/>
       </w:pPr>
@@ -703,19 +613,26 @@
       </w:r>
       <w:r>
         <w:rPr>
-          <w:b/>
-          <w:bCs/>
-          <w:sz w:val="20"/>
-          <w:szCs w:val="20"/>
-        </w:rPr>
-        <w:t xml:space="preserve">Customer visits www.aieclothing.com </w:t>
-      </w:r>
-      <w:r>
-        <w:rPr>
-          <w:sz w:val="20"/>
-          <w:szCs w:val="20"/>
-        </w:rPr>
-        <w:t xml:space="preserve">on their phone or computer</w:t>
+          <w:sz w:val="20"/>
+          <w:szCs w:val="20"/>
+        </w:rPr>
+        <w:t xml:space="preserve">Customer visits </w:t>
+      </w:r>
+      <w:r>
+        <w:rPr>
+          <w:b/>
+          <w:bCs/>
+          <w:sz w:val="20"/>
+          <w:szCs w:val="20"/>
+        </w:rPr>
+        <w:t xml:space="preserve">www.aieclothing.com</w:t>
+      </w:r>
+      <w:r>
+        <w:rPr>
+          <w:sz w:val="20"/>
+          <w:szCs w:val="20"/>
+        </w:rPr>
+        <w:t xml:space="preserve">, browses, picks their size, adds to cart</w:t>
       </w:r>
     </w:p>
     <w:p>
@@ -731,7 +648,7 @@
           <w:sz w:val="20"/>
           <w:szCs w:val="20"/>
         </w:rPr>
-        <w:t xml:space="preserve">They browse your pieces, choose their size and quantity, and add to their cart</w:t>
+        <w:t xml:space="preserve">They checkout, fill in their address, and pay — card, bank transfer, or USSD</w:t>
       </w:r>
     </w:p>
     <w:p>
@@ -747,7 +664,23 @@
           <w:sz w:val="20"/>
           <w:szCs w:val="20"/>
         </w:rPr>
-        <w:t xml:space="preserve">They go to checkout, fill in their name, phone number, and delivery address</w:t>
+        <w:t xml:space="preserve">Money hits your </w:t>
+      </w:r>
+      <w:r>
+        <w:rPr>
+          <w:b/>
+          <w:bCs/>
+          <w:sz w:val="20"/>
+          <w:szCs w:val="20"/>
+        </w:rPr>
+        <w:t xml:space="preserve">Paystack account</w:t>
+      </w:r>
+      <w:r>
+        <w:rPr>
+          <w:sz w:val="20"/>
+          <w:szCs w:val="20"/>
+        </w:rPr>
+        <w:t xml:space="preserve"> immediately</w:t>
       </w:r>
     </w:p>
     <w:p>
@@ -763,7 +696,23 @@
           <w:sz w:val="20"/>
           <w:szCs w:val="20"/>
         </w:rPr>
-        <w:t xml:space="preserve">They pay securely using their bank card, bank transfer, or USSD (no cash needed)</w:t>
+        <w:t xml:space="preserve">You get an </w:t>
+      </w:r>
+      <w:r>
+        <w:rPr>
+          <w:b/>
+          <w:bCs/>
+          <w:sz w:val="20"/>
+          <w:szCs w:val="20"/>
+        </w:rPr>
+        <w:t xml:space="preserve">email notification</w:t>
+      </w:r>
+      <w:r>
+        <w:rPr>
+          <w:sz w:val="20"/>
+          <w:szCs w:val="20"/>
+        </w:rPr>
+        <w:t xml:space="preserve"> with all the order details</w:t>
       </w:r>
     </w:p>
     <w:p>
@@ -779,23 +728,7 @@
           <w:sz w:val="20"/>
           <w:szCs w:val="20"/>
         </w:rPr>
-        <w:t xml:space="preserve">Their payment goes into your </w:t>
-      </w:r>
-      <w:r>
-        <w:rPr>
-          <w:b/>
-          <w:bCs/>
-          <w:sz w:val="20"/>
-          <w:szCs w:val="20"/>
-        </w:rPr>
-        <w:t xml:space="preserve">Paystack account</w:t>
-      </w:r>
-      <w:r>
-        <w:rPr>
-          <w:sz w:val="20"/>
-          <w:szCs w:val="20"/>
-        </w:rPr>
-        <w:t xml:space="preserve"> immediately</w:t>
+        <w:t xml:space="preserve">You prepare and ship the order, then update the status in your dashboard</w:t>
       </w:r>
     </w:p>
     <w:p>
@@ -811,87 +744,7 @@
           <w:sz w:val="20"/>
           <w:szCs w:val="20"/>
         </w:rPr>
-        <w:t xml:space="preserve">You receive an </w:t>
-      </w:r>
-      <w:r>
-        <w:rPr>
-          <w:b/>
-          <w:bCs/>
-          <w:sz w:val="20"/>
-          <w:szCs w:val="20"/>
-        </w:rPr>
-        <w:t xml:space="preserve">email notification</w:t>
-      </w:r>
-      <w:r>
-        <w:rPr>
-          <w:sz w:val="20"/>
-          <w:szCs w:val="20"/>
-        </w:rPr>
-        <w:t xml:space="preserve"> telling you someone has ordered</w:t>
-      </w:r>
-    </w:p>
-    <w:p>
-      <w:pPr>
-        <w:spacing w:after="80"/>
-        <w:ind w:left="360"/>
-      </w:pPr>
-      <w:r>
-        <w:t xml:space="preserve">•  </w:t>
-      </w:r>
-      <w:r>
-        <w:rPr>
-          <w:sz w:val="20"/>
-          <w:szCs w:val="20"/>
-        </w:rPr>
-        <w:t xml:space="preserve">You also receive a </w:t>
-      </w:r>
-      <w:r>
-        <w:rPr>
-          <w:b/>
-          <w:bCs/>
-          <w:sz w:val="20"/>
-          <w:szCs w:val="20"/>
-        </w:rPr>
-        <w:t xml:space="preserve">WhatsApp message option</w:t>
-      </w:r>
-      <w:r>
-        <w:rPr>
-          <w:sz w:val="20"/>
-          <w:szCs w:val="20"/>
-        </w:rPr>
-        <w:t xml:space="preserve"> to contact the customer directly</w:t>
-      </w:r>
-    </w:p>
-    <w:p>
-      <w:pPr>
-        <w:spacing w:after="80"/>
-        <w:ind w:left="360"/>
-      </w:pPr>
-      <w:r>
-        <w:t xml:space="preserve">•  </w:t>
-      </w:r>
-      <w:r>
-        <w:rPr>
-          <w:sz w:val="20"/>
-          <w:szCs w:val="20"/>
-        </w:rPr>
-        <w:t xml:space="preserve">You prepare the order, ship it, and update the status in your dashboard</w:t>
-      </w:r>
-    </w:p>
-    <w:p>
-      <w:pPr>
-        <w:spacing w:after="80"/>
-        <w:ind w:left="360"/>
-      </w:pPr>
-      <w:r>
-        <w:t xml:space="preserve">•  </w:t>
-      </w:r>
-      <w:r>
-        <w:rPr>
-          <w:sz w:val="20"/>
-          <w:szCs w:val="20"/>
-        </w:rPr>
-        <w:t xml:space="preserve">Paystack sends the money to your </w:t>
+        <w:t xml:space="preserve">Paystack moves the money to your </w:t>
       </w:r>
       <w:r>
         <w:rPr>
@@ -901,23 +754,6 @@
           <w:szCs w:val="20"/>
         </w:rPr>
         <w:t xml:space="preserve">bank account the next business day</w:t>
-      </w:r>
-    </w:p>
-    <w:p>
-      <w:pPr>
-        <w:spacing w:after="120"/>
-      </w:pPr>
-    </w:p>
-    <w:p>
-      <w:pPr>
-        <w:spacing w:after="100"/>
-      </w:pPr>
-      <w:r>
-        <w:rPr>
-          <w:sz w:val="20"/>
-          <w:szCs w:val="20"/>
-        </w:rPr>
-        <w:t xml:space="preserve">Everything happens automatically — you just need to check your orders and prepare the pieces for delivery.</w:t>
       </w:r>
     </w:p>
     <w:p>
@@ -940,25 +776,43 @@
           <w:sz w:val="28"/>
           <w:szCs w:val="28"/>
         </w:rPr>
-        <w:t xml:space="preserve">SECTION 3 — How to Add a New Product</w:t>
+        <w:t xml:space="preserve">SECTION 3 — Adding a Product</w:t>
       </w:r>
     </w:p>
     <w:p>
       <w:pPr>
         <w:spacing w:after="100"/>
-      </w:pPr>
-      <w:r>
-        <w:rPr>
-          <w:sz w:val="20"/>
-          <w:szCs w:val="20"/>
-        </w:rPr>
-        <w:t xml:space="preserve">Every time you have a new piece to sell, follow these steps to add it to your store. It takes about 5 minutes.</w:t>
-      </w:r>
-    </w:p>
-    <w:p>
-      <w:pPr>
-        <w:spacing w:after="120"/>
-      </w:pPr>
+        <w:ind w:left="360"/>
+      </w:pPr>
+      <w:r>
+        <w:rPr>
+          <w:b/>
+          <w:bCs/>
+          <w:color w:val="C4773B"/>
+          <w:sz w:val="20"/>
+          <w:szCs w:val="20"/>
+        </w:rPr>
+        <w:t xml:space="preserve">1.</w:t>
+      </w:r>
+      <w:r>
+        <w:t xml:space="preserve">  </w:t>
+      </w:r>
+      <w:r>
+        <w:rPr>
+          <w:sz w:val="20"/>
+          <w:szCs w:val="20"/>
+        </w:rPr>
+        <w:t xml:space="preserve">Go to </w:t>
+      </w:r>
+      <w:r>
+        <w:rPr>
+          <w:b/>
+          <w:bCs/>
+          <w:sz w:val="20"/>
+          <w:szCs w:val="20"/>
+        </w:rPr>
+        <w:t xml:space="preserve">Admin → Products → Add Product</w:t>
+      </w:r>
     </w:p>
     <w:p>
       <w:pPr>
@@ -973,110 +827,17 @@
           <w:sz w:val="20"/>
           <w:szCs w:val="20"/>
         </w:rPr>
-        <w:t xml:space="preserve">1.</w:t>
+        <w:t xml:space="preserve">2.</w:t>
       </w:r>
       <w:r>
         <w:t xml:space="preserve">  </w:t>
       </w:r>
       <w:r>
         <w:rPr>
-          <w:b/>
-          <w:bCs/>
-          <w:sz w:val="20"/>
-          <w:szCs w:val="20"/>
-        </w:rPr>
-        <w:t xml:space="preserve">Log into your Admin Dashboard</w:t>
-      </w:r>
-      <w:r>
-        <w:rPr>
-          <w:sz w:val="20"/>
-          <w:szCs w:val="20"/>
-        </w:rPr>
-        <w:t xml:space="preserve"> — go to www.aieclothing.com/admin on your phone</w:t>
-      </w:r>
-    </w:p>
-    <w:p>
-      <w:pPr>
-        <w:spacing w:after="100"/>
-        <w:ind w:left="360"/>
-      </w:pPr>
-      <w:r>
-        <w:rPr>
-          <w:b/>
-          <w:bCs/>
-          <w:color w:val="C4773B"/>
-          <w:sz w:val="20"/>
-          <w:szCs w:val="20"/>
-        </w:rPr>
-        <w:t xml:space="preserve">2.</w:t>
-      </w:r>
-      <w:r>
-        <w:t xml:space="preserve">  </w:t>
-      </w:r>
-      <w:r>
-        <w:rPr>
-          <w:sz w:val="20"/>
-          <w:szCs w:val="20"/>
-        </w:rPr>
-        <w:t xml:space="preserve">Click </w:t>
-      </w:r>
-      <w:r>
-        <w:rPr>
-          <w:b/>
-          <w:bCs/>
-          <w:sz w:val="20"/>
-          <w:szCs w:val="20"/>
-        </w:rPr>
-        <w:t xml:space="preserve">'Products'</w:t>
-      </w:r>
-      <w:r>
-        <w:rPr>
-          <w:sz w:val="20"/>
-          <w:szCs w:val="20"/>
-        </w:rPr>
-        <w:t xml:space="preserve"> in the menu, then click the orange </w:t>
-      </w:r>
-      <w:r>
-        <w:rPr>
-          <w:b/>
-          <w:bCs/>
-          <w:sz w:val="20"/>
-          <w:szCs w:val="20"/>
-        </w:rPr>
-        <w:t xml:space="preserve">'Add Product'</w:t>
-      </w:r>
-      <w:r>
-        <w:rPr>
-          <w:sz w:val="20"/>
-          <w:szCs w:val="20"/>
-        </w:rPr>
-        <w:t xml:space="preserve"> button</w:t>
-      </w:r>
-    </w:p>
-    <w:p>
-      <w:pPr>
-        <w:spacing w:after="100"/>
-        <w:ind w:left="360"/>
-      </w:pPr>
-      <w:r>
-        <w:rPr>
-          <w:b/>
-          <w:bCs/>
-          <w:color w:val="C4773B"/>
-          <w:sz w:val="20"/>
-          <w:szCs w:val="20"/>
-        </w:rPr>
-        <w:t xml:space="preserve">3.</w:t>
-      </w:r>
-      <w:r>
-        <w:t xml:space="preserve">  </w:t>
-      </w:r>
-      <w:r>
-        <w:rPr>
-          <w:sz w:val="20"/>
-          <w:szCs w:val="20"/>
-        </w:rPr>
-        <w:t xml:space="preserve">Fill in the </w:t>
+          <w:sz w:val="20"/>
+          <w:szCs w:val="20"/>
+        </w:rPr>
+        <w:t xml:space="preserve">Enter the </w:t>
       </w:r>
       <w:r>
         <w:rPr>
@@ -1092,7 +853,7 @@
           <w:sz w:val="20"/>
           <w:szCs w:val="20"/>
         </w:rPr>
-        <w:t xml:space="preserve"> — be clear and descriptive. Example: </w:t>
+        <w:t xml:space="preserve"> — e.g. </w:t>
       </w:r>
       <w:r>
         <w:rPr>
@@ -1118,6 +879,48 @@
           <w:sz w:val="20"/>
           <w:szCs w:val="20"/>
         </w:rPr>
+        <w:t xml:space="preserve">3.</w:t>
+      </w:r>
+      <w:r>
+        <w:t xml:space="preserve">  </w:t>
+      </w:r>
+      <w:r>
+        <w:rPr>
+          <w:sz w:val="20"/>
+          <w:szCs w:val="20"/>
+        </w:rPr>
+        <w:t xml:space="preserve">Write a </w:t>
+      </w:r>
+      <w:r>
+        <w:rPr>
+          <w:b/>
+          <w:bCs/>
+          <w:sz w:val="20"/>
+          <w:szCs w:val="20"/>
+        </w:rPr>
+        <w:t xml:space="preserve">Description</w:t>
+      </w:r>
+      <w:r>
+        <w:rPr>
+          <w:sz w:val="20"/>
+          <w:szCs w:val="20"/>
+        </w:rPr>
+        <w:t xml:space="preserve"> — fabric, fit, what occasions it works for</w:t>
+      </w:r>
+    </w:p>
+    <w:p>
+      <w:pPr>
+        <w:spacing w:after="100"/>
+        <w:ind w:left="360"/>
+      </w:pPr>
+      <w:r>
+        <w:rPr>
+          <w:b/>
+          <w:bCs/>
+          <w:color w:val="C4773B"/>
+          <w:sz w:val="20"/>
+          <w:szCs w:val="20"/>
+        </w:rPr>
         <w:t xml:space="preserve">4.</w:t>
       </w:r>
       <w:r>
@@ -1128,49 +931,7 @@
           <w:sz w:val="20"/>
           <w:szCs w:val="20"/>
         </w:rPr>
-        <w:t xml:space="preserve">Write a </w:t>
-      </w:r>
-      <w:r>
-        <w:rPr>
-          <w:b/>
-          <w:bCs/>
-          <w:sz w:val="20"/>
-          <w:szCs w:val="20"/>
-        </w:rPr>
-        <w:t xml:space="preserve">Description</w:t>
-      </w:r>
-      <w:r>
-        <w:rPr>
-          <w:sz w:val="20"/>
-          <w:szCs w:val="20"/>
-        </w:rPr>
-        <w:t xml:space="preserve"> — talk about the fabric, the style, what occasions it suits, how it fits. Good descriptions help customers decide to buy.</w:t>
-      </w:r>
-    </w:p>
-    <w:p>
-      <w:pPr>
-        <w:spacing w:after="100"/>
-        <w:ind w:left="360"/>
-      </w:pPr>
-      <w:r>
-        <w:rPr>
-          <w:b/>
-          <w:bCs/>
-          <w:color w:val="C4773B"/>
-          <w:sz w:val="20"/>
-          <w:szCs w:val="20"/>
-        </w:rPr>
-        <w:t xml:space="preserve">5.</w:t>
-      </w:r>
-      <w:r>
-        <w:t xml:space="preserve">  </w:t>
-      </w:r>
-      <w:r>
-        <w:rPr>
-          <w:sz w:val="20"/>
-          <w:szCs w:val="20"/>
-        </w:rPr>
-        <w:t xml:space="preserve">Enter the </w:t>
+        <w:t xml:space="preserve">Set the </w:t>
       </w:r>
       <w:r>
         <w:rPr>
@@ -1186,7 +947,7 @@
           <w:sz w:val="20"/>
           <w:szCs w:val="20"/>
         </w:rPr>
-        <w:t xml:space="preserve"> in Naira — numbers only, no ₦ symbol. Example: </w:t>
+        <w:t xml:space="preserve"> in Naira — numbers only, e.g. </w:t>
       </w:r>
       <w:r>
         <w:rPr>
@@ -1212,6 +973,48 @@
           <w:sz w:val="20"/>
           <w:szCs w:val="20"/>
         </w:rPr>
+        <w:t xml:space="preserve">5.</w:t>
+      </w:r>
+      <w:r>
+        <w:t xml:space="preserve">  </w:t>
+      </w:r>
+      <w:r>
+        <w:rPr>
+          <w:sz w:val="20"/>
+          <w:szCs w:val="20"/>
+        </w:rPr>
+        <w:t xml:space="preserve">Set </w:t>
+      </w:r>
+      <w:r>
+        <w:rPr>
+          <w:b/>
+          <w:bCs/>
+          <w:sz w:val="20"/>
+          <w:szCs w:val="20"/>
+        </w:rPr>
+        <w:t xml:space="preserve">Stock</w:t>
+      </w:r>
+      <w:r>
+        <w:rPr>
+          <w:sz w:val="20"/>
+          <w:szCs w:val="20"/>
+        </w:rPr>
+        <w:t xml:space="preserve"> — how many you have. If 3, type 3.</w:t>
+      </w:r>
+    </w:p>
+    <w:p>
+      <w:pPr>
+        <w:spacing w:after="100"/>
+        <w:ind w:left="360"/>
+      </w:pPr>
+      <w:r>
+        <w:rPr>
+          <w:b/>
+          <w:bCs/>
+          <w:color w:val="C4773B"/>
+          <w:sz w:val="20"/>
+          <w:szCs w:val="20"/>
+        </w:rPr>
         <w:t xml:space="preserve">6.</w:t>
       </w:r>
       <w:r>
@@ -1222,23 +1025,23 @@
           <w:sz w:val="20"/>
           <w:szCs w:val="20"/>
         </w:rPr>
-        <w:t xml:space="preserve">Enter the </w:t>
-      </w:r>
-      <w:r>
-        <w:rPr>
-          <w:b/>
-          <w:bCs/>
-          <w:sz w:val="20"/>
-          <w:szCs w:val="20"/>
-        </w:rPr>
-        <w:t xml:space="preserve">Stock</w:t>
-      </w:r>
-      <w:r>
-        <w:rPr>
-          <w:sz w:val="20"/>
-          <w:szCs w:val="20"/>
-        </w:rPr>
-        <w:t xml:space="preserve"> — how many pieces you have available. If you have 3, type 3.</w:t>
+        <w:t xml:space="preserve">Pick the </w:t>
+      </w:r>
+      <w:r>
+        <w:rPr>
+          <w:b/>
+          <w:bCs/>
+          <w:sz w:val="20"/>
+          <w:szCs w:val="20"/>
+        </w:rPr>
+        <w:t xml:space="preserve">Category</w:t>
+      </w:r>
+      <w:r>
+        <w:rPr>
+          <w:sz w:val="20"/>
+          <w:szCs w:val="20"/>
+        </w:rPr>
+        <w:t xml:space="preserve"> — Bubu Designs, Asooke, etc.</w:t>
       </w:r>
     </w:p>
     <w:p>
@@ -1264,23 +1067,39 @@
           <w:sz w:val="20"/>
           <w:szCs w:val="20"/>
         </w:rPr>
-        <w:t xml:space="preserve">Choose the </w:t>
-      </w:r>
-      <w:r>
-        <w:rPr>
-          <w:b/>
-          <w:bCs/>
-          <w:sz w:val="20"/>
-          <w:szCs w:val="20"/>
-        </w:rPr>
-        <w:t xml:space="preserve">Category</w:t>
-      </w:r>
-      <w:r>
-        <w:rPr>
-          <w:sz w:val="20"/>
-          <w:szCs w:val="20"/>
-        </w:rPr>
-        <w:t xml:space="preserve"> — pick the right one (Bubu Designs, Asooke, Tops and Short, etc.)</w:t>
+        <w:t xml:space="preserve">Tick </w:t>
+      </w:r>
+      <w:r>
+        <w:rPr>
+          <w:b/>
+          <w:bCs/>
+          <w:sz w:val="20"/>
+          <w:szCs w:val="20"/>
+        </w:rPr>
+        <w:t xml:space="preserve">Featured</w:t>
+      </w:r>
+      <w:r>
+        <w:rPr>
+          <w:sz w:val="20"/>
+          <w:szCs w:val="20"/>
+        </w:rPr>
+        <w:t xml:space="preserve"> to show it on the home page. Always tick </w:t>
+      </w:r>
+      <w:r>
+        <w:rPr>
+          <w:b/>
+          <w:bCs/>
+          <w:sz w:val="20"/>
+          <w:szCs w:val="20"/>
+        </w:rPr>
+        <w:t xml:space="preserve">Active</w:t>
+      </w:r>
+      <w:r>
+        <w:rPr>
+          <w:sz w:val="20"/>
+          <w:szCs w:val="20"/>
+        </w:rPr>
+        <w:t xml:space="preserve"> so it's visible.</w:t>
       </w:r>
     </w:p>
     <w:p>
@@ -1306,39 +1125,23 @@
           <w:sz w:val="20"/>
           <w:szCs w:val="20"/>
         </w:rPr>
-        <w:t xml:space="preserve">Tick </w:t>
-      </w:r>
-      <w:r>
-        <w:rPr>
-          <w:b/>
-          <w:bCs/>
-          <w:sz w:val="20"/>
-          <w:szCs w:val="20"/>
-        </w:rPr>
-        <w:t xml:space="preserve">'Featured'</w:t>
-      </w:r>
-      <w:r>
-        <w:rPr>
-          <w:sz w:val="20"/>
-          <w:szCs w:val="20"/>
-        </w:rPr>
-        <w:t xml:space="preserve"> if you want this piece to appear on the home page. Tick </w:t>
-      </w:r>
-      <w:r>
-        <w:rPr>
-          <w:b/>
-          <w:bCs/>
-          <w:sz w:val="20"/>
-          <w:szCs w:val="20"/>
-        </w:rPr>
-        <w:t xml:space="preserve">'Active'</w:t>
-      </w:r>
-      <w:r>
-        <w:rPr>
-          <w:sz w:val="20"/>
-          <w:szCs w:val="20"/>
-        </w:rPr>
-        <w:t xml:space="preserve"> so customers can see it — always tick this.</w:t>
+        <w:t xml:space="preserve">Click </w:t>
+      </w:r>
+      <w:r>
+        <w:rPr>
+          <w:b/>
+          <w:bCs/>
+          <w:sz w:val="20"/>
+          <w:szCs w:val="20"/>
+        </w:rPr>
+        <w:t xml:space="preserve">Upload from device</w:t>
+      </w:r>
+      <w:r>
+        <w:rPr>
+          <w:sz w:val="20"/>
+          <w:szCs w:val="20"/>
+        </w:rPr>
+        <w:t xml:space="preserve"> — select photos from your phone. First photo = main display image.</w:t>
       </w:r>
     </w:p>
     <w:p>
@@ -1364,23 +1167,23 @@
           <w:sz w:val="20"/>
           <w:szCs w:val="20"/>
         </w:rPr>
-        <w:t xml:space="preserve">Click </w:t>
-      </w:r>
-      <w:r>
-        <w:rPr>
-          <w:b/>
-          <w:bCs/>
-          <w:sz w:val="20"/>
-          <w:szCs w:val="20"/>
-        </w:rPr>
-        <w:t xml:space="preserve">'Upload from device'</w:t>
-      </w:r>
-      <w:r>
-        <w:rPr>
-          <w:sz w:val="20"/>
-          <w:szCs w:val="20"/>
-        </w:rPr>
-        <w:t xml:space="preserve"> to add your photos from your phone. You can upload multiple photos. The first one becomes the main photo customers see.</w:t>
+        <w:t xml:space="preserve">Add </w:t>
+      </w:r>
+      <w:r>
+        <w:rPr>
+          <w:b/>
+          <w:bCs/>
+          <w:sz w:val="20"/>
+          <w:szCs w:val="20"/>
+        </w:rPr>
+        <w:t xml:space="preserve">Sizes</w:t>
+      </w:r>
+      <w:r>
+        <w:rPr>
+          <w:sz w:val="20"/>
+          <w:szCs w:val="20"/>
+        </w:rPr>
+        <w:t xml:space="preserve"> — type S, M, L, XL etc. and press Enter after each</w:t>
       </w:r>
     </w:p>
     <w:p>
@@ -1415,56 +1218,14 @@
           <w:sz w:val="20"/>
           <w:szCs w:val="20"/>
         </w:rPr>
-        <w:t xml:space="preserve">Sizes</w:t>
-      </w:r>
-      <w:r>
-        <w:rPr>
-          <w:sz w:val="20"/>
-          <w:szCs w:val="20"/>
-        </w:rPr>
-        <w:t xml:space="preserve"> — type each size and press Enter: S, M, L, XL, XXL, 3XL. Add whichever sizes you have.</w:t>
-      </w:r>
-    </w:p>
-    <w:p>
-      <w:pPr>
-        <w:spacing w:after="100"/>
-        <w:ind w:left="360"/>
-      </w:pPr>
-      <w:r>
-        <w:rPr>
-          <w:b/>
-          <w:bCs/>
-          <w:color w:val="C4773B"/>
-          <w:sz w:val="20"/>
-          <w:szCs w:val="20"/>
-        </w:rPr>
-        <w:t xml:space="preserve">11.</w:t>
-      </w:r>
-      <w:r>
-        <w:t xml:space="preserve">  </w:t>
-      </w:r>
-      <w:r>
-        <w:rPr>
-          <w:sz w:val="20"/>
-          <w:szCs w:val="20"/>
-        </w:rPr>
-        <w:t xml:space="preserve">Add </w:t>
-      </w:r>
-      <w:r>
-        <w:rPr>
-          <w:b/>
-          <w:bCs/>
-          <w:sz w:val="20"/>
-          <w:szCs w:val="20"/>
-        </w:rPr>
-        <w:t xml:space="preserve">Colours or variants</w:t>
-      </w:r>
-      <w:r>
-        <w:rPr>
-          <w:sz w:val="20"/>
-          <w:szCs w:val="20"/>
-        </w:rPr>
-        <w:t xml:space="preserve"> if needed — type the colour name and press Enter. Example: </w:t>
+        <w:t xml:space="preserve">Colours</w:t>
+      </w:r>
+      <w:r>
+        <w:rPr>
+          <w:sz w:val="20"/>
+          <w:szCs w:val="20"/>
+        </w:rPr>
+        <w:t xml:space="preserve"> if needed — e.g. </w:t>
       </w:r>
       <w:r>
         <w:rPr>
@@ -1474,7 +1235,14 @@
           <w:sz w:val="20"/>
           <w:szCs w:val="20"/>
         </w:rPr>
-        <w:t xml:space="preserve">"Red Ankara", "Blue Ankara"</w:t>
+        <w:t xml:space="preserve">"Red Ankara"</w:t>
+      </w:r>
+      <w:r>
+        <w:rPr>
+          <w:sz w:val="20"/>
+          <w:szCs w:val="20"/>
+        </w:rPr>
+        <w:t xml:space="preserve">, press Enter</w:t>
       </w:r>
     </w:p>
     <w:p>
@@ -1490,7 +1258,7 @@
           <w:sz w:val="20"/>
           <w:szCs w:val="20"/>
         </w:rPr>
-        <w:t xml:space="preserve">12.</w:t>
+        <w:t xml:space="preserve">11.</w:t>
       </w:r>
       <w:r>
         <w:t xml:space="preserve">  </w:t>
@@ -1509,14 +1277,14 @@
           <w:sz w:val="20"/>
           <w:szCs w:val="20"/>
         </w:rPr>
-        <w:t xml:space="preserve">'Create Product'</w:t>
-      </w:r>
-      <w:r>
-        <w:rPr>
-          <w:sz w:val="20"/>
-          <w:szCs w:val="20"/>
-        </w:rPr>
-        <w:t xml:space="preserve"> — the piece is now live on your store immediately</w:t>
+        <w:t xml:space="preserve">Create Product</w:t>
+      </w:r>
+      <w:r>
+        <w:rPr>
+          <w:sz w:val="20"/>
+          <w:szCs w:val="20"/>
+        </w:rPr>
+        <w:t xml:space="preserve"> — live immediately</w:t>
       </w:r>
     </w:p>
     <w:p>
@@ -1536,7 +1304,7 @@
           <w:sz w:val="22"/>
           <w:szCs w:val="22"/>
         </w:rPr>
-        <w:t xml:space="preserve">Tips for Good Product Photos</w:t>
+        <w:t xml:space="preserve">Photo tips</w:t>
       </w:r>
     </w:p>
     <w:p>
@@ -1552,23 +1320,7 @@
           <w:sz w:val="20"/>
           <w:szCs w:val="20"/>
         </w:rPr>
-        <w:t xml:space="preserve">Take photos near a </w:t>
-      </w:r>
-      <w:r>
-        <w:rPr>
-          <w:b/>
-          <w:bCs/>
-          <w:sz w:val="20"/>
-          <w:szCs w:val="20"/>
-        </w:rPr>
-        <w:t xml:space="preserve">window in natural light</w:t>
-      </w:r>
-      <w:r>
-        <w:rPr>
-          <w:sz w:val="20"/>
-          <w:szCs w:val="20"/>
-        </w:rPr>
-        <w:t xml:space="preserve"> — this makes colours look accurate and bright</w:t>
+        <w:t xml:space="preserve">Natural light near a window — colours look much better</w:t>
       </w:r>
     </w:p>
     <w:p>
@@ -1584,23 +1336,7 @@
           <w:sz w:val="20"/>
           <w:szCs w:val="20"/>
         </w:rPr>
-        <w:t xml:space="preserve">Use a </w:t>
-      </w:r>
-      <w:r>
-        <w:rPr>
-          <w:b/>
-          <w:bCs/>
-          <w:sz w:val="20"/>
-          <w:szCs w:val="20"/>
-        </w:rPr>
-        <w:t xml:space="preserve">plain background</w:t>
-      </w:r>
-      <w:r>
-        <w:rPr>
-          <w:sz w:val="20"/>
-          <w:szCs w:val="20"/>
-        </w:rPr>
-        <w:t xml:space="preserve"> — white wall, cream fabric, or plain door</w:t>
+        <w:t xml:space="preserve">Plain background — white wall or plain fabric</w:t>
       </w:r>
     </w:p>
     <w:p>
@@ -1616,23 +1352,7 @@
           <w:sz w:val="20"/>
           <w:szCs w:val="20"/>
         </w:rPr>
-        <w:t xml:space="preserve">Take at least 3 photos: </w:t>
-      </w:r>
-      <w:r>
-        <w:rPr>
-          <w:b/>
-          <w:bCs/>
-          <w:sz w:val="20"/>
-          <w:szCs w:val="20"/>
-        </w:rPr>
-        <w:t xml:space="preserve">front, back, and a close-up</w:t>
-      </w:r>
-      <w:r>
-        <w:rPr>
-          <w:sz w:val="20"/>
-          <w:szCs w:val="20"/>
-        </w:rPr>
-        <w:t xml:space="preserve"> of the fabric or detail</w:t>
+        <w:t xml:space="preserve">At least 3 shots: front, back, close-up of fabric</w:t>
       </w:r>
     </w:p>
     <w:p>
@@ -1648,55 +1368,7 @@
           <w:sz w:val="20"/>
           <w:szCs w:val="20"/>
         </w:rPr>
-        <w:t xml:space="preserve">If you have a model or mannequin, use it — pieces sell better when shown on a person</w:t>
-      </w:r>
-    </w:p>
-    <w:p>
-      <w:pPr>
-        <w:spacing w:after="80"/>
-        <w:ind w:left="360"/>
-      </w:pPr>
-      <w:r>
-        <w:t xml:space="preserve">•  </w:t>
-      </w:r>
-      <w:r>
-        <w:rPr>
-          <w:sz w:val="20"/>
-          <w:szCs w:val="20"/>
-        </w:rPr>
-        <w:t xml:space="preserve">On iPhone: use </w:t>
-      </w:r>
-      <w:r>
-        <w:rPr>
-          <w:b/>
-          <w:bCs/>
-          <w:sz w:val="20"/>
-          <w:szCs w:val="20"/>
-        </w:rPr>
-        <w:t xml:space="preserve">Portrait mode</w:t>
-      </w:r>
-      <w:r>
-        <w:rPr>
-          <w:sz w:val="20"/>
-          <w:szCs w:val="20"/>
-        </w:rPr>
-        <w:t xml:space="preserve"> for clean, professional-looking shots</w:t>
-      </w:r>
-    </w:p>
-    <w:p>
-      <w:pPr>
-        <w:spacing w:after="80"/>
-        <w:ind w:left="360"/>
-      </w:pPr>
-      <w:r>
-        <w:t xml:space="preserve">•  </w:t>
-      </w:r>
-      <w:r>
-        <w:rPr>
-          <w:sz w:val="20"/>
-          <w:szCs w:val="20"/>
-        </w:rPr>
-        <w:t xml:space="preserve">Avoid dark photos, cluttered backgrounds, or photos with watermarks on them</w:t>
+        <w:t xml:space="preserve">Portrait mode on iPhone works great</w:t>
       </w:r>
     </w:p>
     <w:p>
@@ -1719,7 +1391,7 @@
           <w:sz w:val="28"/>
           <w:szCs w:val="28"/>
         </w:rPr>
-        <w:t xml:space="preserve">SECTION 4 — How to See and Manage Your Orders</w:t>
+        <w:t xml:space="preserve">SECTION 4 — Managing Orders</w:t>
       </w:r>
     </w:p>
     <w:p>
@@ -1731,27 +1403,7 @@
           <w:sz w:val="20"/>
           <w:szCs w:val="20"/>
         </w:rPr>
-        <w:t xml:space="preserve">Every time a customer pays and places an order, it appears in your Orders section. You will also receive an email notification.</w:t>
-      </w:r>
-    </w:p>
-    <w:p>
-      <w:pPr>
-        <w:spacing w:after="120"/>
-      </w:pPr>
-    </w:p>
-    <w:p>
-      <w:pPr>
-        <w:spacing w:after="80" w:before="200"/>
-      </w:pPr>
-      <w:r>
-        <w:rPr>
-          <w:b/>
-          <w:bCs/>
-          <w:color w:val="111111"/>
-          <w:sz w:val="22"/>
-          <w:szCs w:val="22"/>
-        </w:rPr>
-        <w:t xml:space="preserve">Viewing Your Orders</w:t>
+        <w:t xml:space="preserve">Every paid order appears here automatically. You'll also get an email.</w:t>
       </w:r>
     </w:p>
     <w:p>
@@ -1777,7 +1429,16 @@
           <w:sz w:val="20"/>
           <w:szCs w:val="20"/>
         </w:rPr>
-        <w:t xml:space="preserve">Log into your Admin Dashboard</w:t>
+        <w:t xml:space="preserve">Go to </w:t>
+      </w:r>
+      <w:r>
+        <w:rPr>
+          <w:b/>
+          <w:bCs/>
+          <w:sz w:val="20"/>
+          <w:szCs w:val="20"/>
+        </w:rPr>
+        <w:t xml:space="preserve">Admin → Orders</w:t>
       </w:r>
     </w:p>
     <w:p>
@@ -1803,23 +1464,7 @@
           <w:sz w:val="20"/>
           <w:szCs w:val="20"/>
         </w:rPr>
-        <w:t xml:space="preserve">Click </w:t>
-      </w:r>
-      <w:r>
-        <w:rPr>
-          <w:b/>
-          <w:bCs/>
-          <w:sz w:val="20"/>
-          <w:szCs w:val="20"/>
-        </w:rPr>
-        <w:t xml:space="preserve">'Orders'</w:t>
-      </w:r>
-      <w:r>
-        <w:rPr>
-          <w:sz w:val="20"/>
-          <w:szCs w:val="20"/>
-        </w:rPr>
-        <w:t xml:space="preserve"> in the menu</w:t>
+        <w:t xml:space="preserve">Click any row to open the full order details</w:t>
       </w:r>
     </w:p>
     <w:p>
@@ -1845,7 +1490,23 @@
           <w:sz w:val="20"/>
           <w:szCs w:val="20"/>
         </w:rPr>
-        <w:t xml:space="preserve">You will see a list of all orders — newest at the top</w:t>
+        <w:t xml:space="preserve">Hit </w:t>
+      </w:r>
+      <w:r>
+        <w:rPr>
+          <w:b/>
+          <w:bCs/>
+          <w:sz w:val="20"/>
+          <w:szCs w:val="20"/>
+        </w:rPr>
+        <w:t xml:space="preserve">WhatsApp Customer</w:t>
+      </w:r>
+      <w:r>
+        <w:rPr>
+          <w:sz w:val="20"/>
+          <w:szCs w:val="20"/>
+        </w:rPr>
+        <w:t xml:space="preserve"> to message them directly</w:t>
       </w:r>
     </w:p>
     <w:p>
@@ -1871,27 +1532,23 @@
           <w:sz w:val="20"/>
           <w:szCs w:val="20"/>
         </w:rPr>
-        <w:t xml:space="preserve">Click on any order row to open it and see all the details</w:t>
-      </w:r>
-    </w:p>
-    <w:p>
-      <w:pPr>
-        <w:spacing w:after="120"/>
-      </w:pPr>
-    </w:p>
-    <w:p>
-      <w:pPr>
-        <w:spacing w:after="80" w:before="200"/>
-      </w:pPr>
-      <w:r>
-        <w:rPr>
-          <w:b/>
-          <w:bCs/>
-          <w:color w:val="111111"/>
-          <w:sz w:val="22"/>
-          <w:szCs w:val="22"/>
-        </w:rPr>
-        <w:t xml:space="preserve">What You See in an Order</w:t>
+        <w:t xml:space="preserve">Use the </w:t>
+      </w:r>
+      <w:r>
+        <w:rPr>
+          <w:b/>
+          <w:bCs/>
+          <w:sz w:val="20"/>
+          <w:szCs w:val="20"/>
+        </w:rPr>
+        <w:t xml:space="preserve">Status dropdown</w:t>
+      </w:r>
+      <w:r>
+        <w:rPr>
+          <w:sz w:val="20"/>
+          <w:szCs w:val="20"/>
+        </w:rPr>
+        <w:t xml:space="preserve"> to update as you go:</w:t>
       </w:r>
     </w:p>
     <w:p>
@@ -1909,7 +1566,14 @@
           <w:sz w:val="20"/>
           <w:szCs w:val="20"/>
         </w:rPr>
-        <w:t xml:space="preserve">Customer name, email, and phone number</w:t>
+        <w:t xml:space="preserve">Pending</w:t>
+      </w:r>
+      <w:r>
+        <w:rPr>
+          <w:sz w:val="20"/>
+          <w:szCs w:val="20"/>
+        </w:rPr>
+        <w:t xml:space="preserve"> → just received</w:t>
       </w:r>
     </w:p>
     <w:p>
@@ -1927,14 +1591,14 @@
           <w:sz w:val="20"/>
           <w:szCs w:val="20"/>
         </w:rPr>
-        <w:t xml:space="preserve">Delivery address</w:t>
-      </w:r>
-      <w:r>
-        <w:rPr>
-          <w:sz w:val="20"/>
-          <w:szCs w:val="20"/>
-        </w:rPr>
-        <w:t xml:space="preserve"> — the address they want it sent to</w:t>
+        <w:t xml:space="preserve">Processing</w:t>
+      </w:r>
+      <w:r>
+        <w:rPr>
+          <w:sz w:val="20"/>
+          <w:szCs w:val="20"/>
+        </w:rPr>
+        <w:t xml:space="preserve"> → preparing</w:t>
       </w:r>
     </w:p>
     <w:p>
@@ -1952,14 +1616,14 @@
           <w:sz w:val="20"/>
           <w:szCs w:val="20"/>
         </w:rPr>
-        <w:t xml:space="preserve">Items ordered</w:t>
-      </w:r>
-      <w:r>
-        <w:rPr>
-          <w:sz w:val="20"/>
-          <w:szCs w:val="20"/>
-        </w:rPr>
-        <w:t xml:space="preserve"> — which pieces, what size, what colour, how many</w:t>
+        <w:t xml:space="preserve">Shipped</w:t>
+      </w:r>
+      <w:r>
+        <w:rPr>
+          <w:sz w:val="20"/>
+          <w:szCs w:val="20"/>
+        </w:rPr>
+        <w:t xml:space="preserve"> → sent out</w:t>
       </w:r>
     </w:p>
     <w:p>
@@ -1977,7 +1641,14 @@
           <w:sz w:val="20"/>
           <w:szCs w:val="20"/>
         </w:rPr>
-        <w:t xml:space="preserve">Total amount paid</w:t>
+        <w:t xml:space="preserve">Delivered</w:t>
+      </w:r>
+      <w:r>
+        <w:rPr>
+          <w:sz w:val="20"/>
+          <w:szCs w:val="20"/>
+        </w:rPr>
+        <w:t xml:space="preserve"> → received by customer</w:t>
       </w:r>
     </w:p>
     <w:p>
@@ -1990,170 +1661,6 @@
       </w:r>
       <w:r>
         <w:rPr>
-          <w:sz w:val="20"/>
-          <w:szCs w:val="20"/>
-        </w:rPr>
-        <w:t xml:space="preserve">A </w:t>
-      </w:r>
-      <w:r>
-        <w:rPr>
-          <w:b/>
-          <w:bCs/>
-          <w:sz w:val="20"/>
-          <w:szCs w:val="20"/>
-        </w:rPr>
-        <w:t xml:space="preserve">'WhatsApp Customer' button</w:t>
-      </w:r>
-      <w:r>
-        <w:rPr>
-          <w:sz w:val="20"/>
-          <w:szCs w:val="20"/>
-        </w:rPr>
-        <w:t xml:space="preserve"> — click this to message them directly on WhatsApp</w:t>
-      </w:r>
-    </w:p>
-    <w:p>
-      <w:pPr>
-        <w:spacing w:after="120"/>
-      </w:pPr>
-    </w:p>
-    <w:p>
-      <w:pPr>
-        <w:spacing w:after="80" w:before="200"/>
-      </w:pPr>
-      <w:r>
-        <w:rPr>
-          <w:b/>
-          <w:bCs/>
-          <w:color w:val="111111"/>
-          <w:sz w:val="22"/>
-          <w:szCs w:val="22"/>
-        </w:rPr>
-        <w:t xml:space="preserve">Updating the Order Status</w:t>
-      </w:r>
-    </w:p>
-    <w:p>
-      <w:pPr>
-        <w:spacing w:after="100"/>
-      </w:pPr>
-      <w:r>
-        <w:rPr>
-          <w:sz w:val="20"/>
-          <w:szCs w:val="20"/>
-        </w:rPr>
-        <w:t xml:space="preserve">Use the Status dropdown on each order to show where things are:</w:t>
-      </w:r>
-    </w:p>
-    <w:p>
-      <w:pPr>
-        <w:spacing w:after="80"/>
-        <w:ind w:left="360"/>
-      </w:pPr>
-      <w:r>
-        <w:t xml:space="preserve">•  </w:t>
-      </w:r>
-      <w:r>
-        <w:rPr>
-          <w:b/>
-          <w:bCs/>
-          <w:sz w:val="20"/>
-          <w:szCs w:val="20"/>
-        </w:rPr>
-        <w:t xml:space="preserve">Pending</w:t>
-      </w:r>
-      <w:r>
-        <w:rPr>
-          <w:sz w:val="20"/>
-          <w:szCs w:val="20"/>
-        </w:rPr>
-        <w:t xml:space="preserve"> — you just received it, not processed yet</w:t>
-      </w:r>
-    </w:p>
-    <w:p>
-      <w:pPr>
-        <w:spacing w:after="80"/>
-        <w:ind w:left="360"/>
-      </w:pPr>
-      <w:r>
-        <w:t xml:space="preserve">•  </w:t>
-      </w:r>
-      <w:r>
-        <w:rPr>
-          <w:b/>
-          <w:bCs/>
-          <w:sz w:val="20"/>
-          <w:szCs w:val="20"/>
-        </w:rPr>
-        <w:t xml:space="preserve">Processing</w:t>
-      </w:r>
-      <w:r>
-        <w:rPr>
-          <w:sz w:val="20"/>
-          <w:szCs w:val="20"/>
-        </w:rPr>
-        <w:t xml:space="preserve"> — you are preparing the order</w:t>
-      </w:r>
-    </w:p>
-    <w:p>
-      <w:pPr>
-        <w:spacing w:after="80"/>
-        <w:ind w:left="360"/>
-      </w:pPr>
-      <w:r>
-        <w:t xml:space="preserve">•  </w:t>
-      </w:r>
-      <w:r>
-        <w:rPr>
-          <w:b/>
-          <w:bCs/>
-          <w:sz w:val="20"/>
-          <w:szCs w:val="20"/>
-        </w:rPr>
-        <w:t xml:space="preserve">Shipped</w:t>
-      </w:r>
-      <w:r>
-        <w:rPr>
-          <w:sz w:val="20"/>
-          <w:szCs w:val="20"/>
-        </w:rPr>
-        <w:t xml:space="preserve"> — you have sent it out for delivery</w:t>
-      </w:r>
-    </w:p>
-    <w:p>
-      <w:pPr>
-        <w:spacing w:after="80"/>
-        <w:ind w:left="360"/>
-      </w:pPr>
-      <w:r>
-        <w:t xml:space="preserve">•  </w:t>
-      </w:r>
-      <w:r>
-        <w:rPr>
-          <w:b/>
-          <w:bCs/>
-          <w:sz w:val="20"/>
-          <w:szCs w:val="20"/>
-        </w:rPr>
-        <w:t xml:space="preserve">Delivered</w:t>
-      </w:r>
-      <w:r>
-        <w:rPr>
-          <w:sz w:val="20"/>
-          <w:szCs w:val="20"/>
-        </w:rPr>
-        <w:t xml:space="preserve"> — the customer has received it</w:t>
-      </w:r>
-    </w:p>
-    <w:p>
-      <w:pPr>
-        <w:spacing w:after="80"/>
-        <w:ind w:left="360"/>
-      </w:pPr>
-      <w:r>
-        <w:t xml:space="preserve">•  </w:t>
-      </w:r>
-      <w:r>
-        <w:rPr>
           <w:b/>
           <w:bCs/>
           <w:sz w:val="20"/>
@@ -2166,33 +1673,7 @@
           <w:sz w:val="20"/>
           <w:szCs w:val="20"/>
         </w:rPr>
-        <w:t xml:space="preserve"> — the order was cancelled for any reason</w:t>
-      </w:r>
-    </w:p>
-    <w:p>
-      <w:pPr>
-        <w:spacing w:after="120"/>
-        <w:ind w:left="360"/>
-      </w:pPr>
-      <w:r>
-        <w:rPr>
-          <w:b/>
-          <w:bCs/>
-          <w:color w:val="C4773B"/>
-          <w:sz w:val="18"/>
-          <w:szCs w:val="18"/>
-        </w:rPr>
-        <w:t xml:space="preserve">Note:  </w:t>
-      </w:r>
-      <w:r>
-        <w:rPr>
-          <w:i/>
-          <w:iCs/>
-          <w:color w:val="666666"/>
-          <w:sz w:val="18"/>
-          <w:szCs w:val="18"/>
-        </w:rPr>
-        <w:t xml:space="preserve">Always update the status when you ship — it helps you track everything and looks professional to customers.</w:t>
+        <w:t xml:space="preserve"> → if needed</w:t>
       </w:r>
     </w:p>
     <w:p>
@@ -2215,22 +1696,7 @@
           <w:sz w:val="28"/>
           <w:szCs w:val="28"/>
         </w:rPr>
-        <w:t xml:space="preserve">SECTION 5 — Payments and Money</w:t>
-      </w:r>
-    </w:p>
-    <w:p>
-      <w:pPr>
-        <w:spacing w:after="80" w:before="200"/>
-      </w:pPr>
-      <w:r>
-        <w:rPr>
-          <w:b/>
-          <w:bCs/>
-          <w:color w:val="111111"/>
-          <w:sz w:val="22"/>
-          <w:szCs w:val="22"/>
-        </w:rPr>
-        <w:t xml:space="preserve">How It Works</w:t>
+        <w:t xml:space="preserve">SECTION 5 — Payments</w:t>
       </w:r>
     </w:p>
     <w:p>
@@ -2242,32 +1708,16 @@
           <w:sz w:val="20"/>
           <w:szCs w:val="20"/>
         </w:rPr>
-        <w:t xml:space="preserve">Customers pay through </w:t>
-      </w:r>
-      <w:r>
-        <w:rPr>
-          <w:b/>
-          <w:bCs/>
-          <w:sz w:val="20"/>
-          <w:szCs w:val="20"/>
-        </w:rPr>
-        <w:t xml:space="preserve">Paystack</w:t>
-      </w:r>
-      <w:r>
-        <w:rPr>
-          <w:sz w:val="20"/>
-          <w:szCs w:val="20"/>
-        </w:rPr>
-        <w:t xml:space="preserve"> — they can use their debit card, bank transfer, or USSD. The moment they pay, the money enters your Paystack account. Paystack then transfers it to your bank account </w:t>
-      </w:r>
-      <w:r>
-        <w:rPr>
-          <w:b/>
-          <w:bCs/>
-          <w:sz w:val="20"/>
-          <w:szCs w:val="20"/>
-        </w:rPr>
-        <w:t xml:space="preserve">automatically the next business day</w:t>
+        <w:t xml:space="preserve">Customers pay via Paystack — card, bank transfer, or USSD. Money goes into your Paystack account immediately, then to your bank </w:t>
+      </w:r>
+      <w:r>
+        <w:rPr>
+          <w:b/>
+          <w:bCs/>
+          <w:sz w:val="20"/>
+          <w:szCs w:val="20"/>
+        </w:rPr>
+        <w:t xml:space="preserve">next business day</w:t>
       </w:r>
       <w:r>
         <w:rPr>
@@ -2281,33 +1731,6 @@
       <w:pPr>
         <w:spacing w:after="120"/>
       </w:pPr>
-    </w:p>
-    <w:p>
-      <w:pPr>
-        <w:spacing w:after="80" w:before="200"/>
-      </w:pPr>
-      <w:r>
-        <w:rPr>
-          <w:b/>
-          <w:bCs/>
-          <w:color w:val="111111"/>
-          <w:sz w:val="22"/>
-          <w:szCs w:val="22"/>
-        </w:rPr>
-        <w:t xml:space="preserve">Paystack Fees</w:t>
-      </w:r>
-    </w:p>
-    <w:p>
-      <w:pPr>
-        <w:spacing w:after="100"/>
-      </w:pPr>
-      <w:r>
-        <w:rPr>
-          <w:sz w:val="20"/>
-          <w:szCs w:val="20"/>
-        </w:rPr>
-        <w:t xml:space="preserve">Paystack charges a small fee on each transaction — this is standard and taken automatically:</w:t>
-      </w:r>
     </w:p>
     <w:tbl>
       <w:tblPr>
@@ -2344,7 +1767,7 @@
                 <w:sz w:val="20"/>
                 <w:szCs w:val="20"/>
               </w:rPr>
-              <w:t xml:space="preserve">Fee Rate</w:t>
+              <w:t xml:space="preserve">Fee</w:t>
             </w:r>
           </w:p>
         </w:tc>
@@ -2364,7 +1787,7 @@
                 <w:sz w:val="20"/>
                 <w:szCs w:val="20"/>
               </w:rPr>
-              <w:t xml:space="preserve">1.5% of the order + ₦100 flat fee</w:t>
+              <w:t xml:space="preserve">1.5% + ₦100 per order (max ₦2,000)</w:t>
             </w:r>
           </w:p>
         </w:tc>
@@ -2388,7 +1811,7 @@
                 <w:sz w:val="20"/>
                 <w:szCs w:val="20"/>
               </w:rPr>
-              <w:t xml:space="preserve">Maximum fee ever</w:t>
+              <w:t xml:space="preserve">₦15,000 order</w:t>
             </w:r>
           </w:p>
         </w:tc>
@@ -2408,7 +1831,7 @@
                 <w:sz w:val="20"/>
                 <w:szCs w:val="20"/>
               </w:rPr>
-              <w:t xml:space="preserve">₦2,000 (no matter how large the order)</w:t>
+              <w:t xml:space="preserve">You receive ₦14,675</w:t>
             </w:r>
           </w:p>
         </w:tc>
@@ -2432,7 +1855,7 @@
                 <w:sz w:val="20"/>
                 <w:szCs w:val="20"/>
               </w:rPr>
-              <w:t xml:space="preserve">Example — ₦15,000 order</w:t>
+              <w:t xml:space="preserve">₦30,000 order</w:t>
             </w:r>
           </w:p>
         </w:tc>
@@ -2452,7 +1875,7 @@
                 <w:sz w:val="20"/>
                 <w:szCs w:val="20"/>
               </w:rPr>
-              <w:t xml:space="preserve">Fee: ₦325 → You receive: ₦14,675</w:t>
+              <w:t xml:space="preserve">You receive ₦29,450</w:t>
             </w:r>
           </w:p>
         </w:tc>
@@ -2476,7 +1899,7 @@
                 <w:sz w:val="20"/>
                 <w:szCs w:val="20"/>
               </w:rPr>
-              <w:t xml:space="preserve">Example — ₦30,000 order</w:t>
+              <w:t xml:space="preserve">₦50,000 order</w:t>
             </w:r>
           </w:p>
         </w:tc>
@@ -2496,82 +1919,12 @@
                 <w:sz w:val="20"/>
                 <w:szCs w:val="20"/>
               </w:rPr>
-              <w:t xml:space="preserve">Fee: ₦550 → You receive: ₦29,450</w:t>
-            </w:r>
-          </w:p>
-        </w:tc>
-      </w:tr>
-      <w:tr>
-        <w:tc>
-          <w:tcPr>
-            <w:tcW w:type="pct" w:w="32%"/>
-            <w:tcMar>
-              <w:top w:type="dxa" w:w="80"/>
-              <w:left w:type="dxa" w:w="120"/>
-              <w:bottom w:type="dxa" w:w="80"/>
-              <w:right w:type="dxa" w:w="80"/>
-            </w:tcMar>
-          </w:tcPr>
-          <w:p>
-            <w:r>
-              <w:rPr>
-                <w:b/>
-                <w:bCs/>
-                <w:sz w:val="20"/>
-                <w:szCs w:val="20"/>
-              </w:rPr>
-              <w:t xml:space="preserve">Example — ₦50,000 order</w:t>
-            </w:r>
-          </w:p>
-        </w:tc>
-        <w:tc>
-          <w:tcPr>
-            <w:tcW w:type="pct" w:w="68%"/>
-            <w:tcMar>
-              <w:top w:type="dxa" w:w="80"/>
-              <w:left w:type="dxa" w:w="120"/>
-              <w:bottom w:type="dxa" w:w="80"/>
-              <w:right w:type="dxa" w:w="80"/>
-            </w:tcMar>
-          </w:tcPr>
-          <w:p>
-            <w:r>
-              <w:rPr>
-                <w:sz w:val="20"/>
-                <w:szCs w:val="20"/>
-              </w:rPr>
-              <w:t xml:space="preserve">Fee: ₦850 → You receive: ₦49,150</w:t>
+              <w:t xml:space="preserve">You receive ₦49,150</w:t>
             </w:r>
           </w:p>
         </w:tc>
       </w:tr>
     </w:tbl>
-    <w:p>
-      <w:pPr>
-        <w:spacing w:after="120"/>
-        <w:ind w:left="360"/>
-      </w:pPr>
-      <w:r>
-        <w:rPr>
-          <w:b/>
-          <w:bCs/>
-          <w:color w:val="C4773B"/>
-          <w:sz w:val="18"/>
-          <w:szCs w:val="18"/>
-        </w:rPr>
-        <w:t xml:space="preserve">Note:  </w:t>
-      </w:r>
-      <w:r>
-        <w:rPr>
-          <w:i/>
-          <w:iCs/>
-          <w:color w:val="666666"/>
-          <w:sz w:val="18"/>
-          <w:szCs w:val="18"/>
-        </w:rPr>
-        <w:t xml:space="preserve">You never pay these fees separately — they are automatically deducted before the money reaches you.</w:t>
-      </w:r>
-    </w:p>
     <w:p>
       <w:pPr>
         <w:spacing w:after="120"/>
@@ -2589,7 +1942,7 @@
           <w:sz w:val="22"/>
           <w:szCs w:val="22"/>
         </w:rPr>
-        <w:t xml:space="preserve">How to Get Your Money from Paystack</w:t>
+        <w:t xml:space="preserve">To receive money in your bank</w:t>
       </w:r>
     </w:p>
     <w:p>
@@ -2626,13 +1979,6 @@
         </w:rPr>
         <w:t xml:space="preserve">dashboard.paystack.com</w:t>
       </w:r>
-      <w:r>
-        <w:rPr>
-          <w:sz w:val="20"/>
-          <w:szCs w:val="20"/>
-        </w:rPr>
-        <w:t xml:space="preserve"> with your email and password</w:t>
-      </w:r>
     </w:p>
     <w:p>
       <w:pPr>
@@ -2666,7 +2012,7 @@
           <w:sz w:val="20"/>
           <w:szCs w:val="20"/>
         </w:rPr>
-        <w:t xml:space="preserve">Settings → Accounts</w:t>
+        <w:t xml:space="preserve">Settings → Accounts → add your bank account</w:t>
       </w:r>
     </w:p>
     <w:p>
@@ -2692,59 +2038,7 @@
           <w:sz w:val="20"/>
           <w:szCs w:val="20"/>
         </w:rPr>
-        <w:t xml:space="preserve">Add your bank account — enter your bank name and account number</w:t>
-      </w:r>
-    </w:p>
-    <w:p>
-      <w:pPr>
-        <w:spacing w:after="100"/>
-        <w:ind w:left="360"/>
-      </w:pPr>
-      <w:r>
-        <w:rPr>
-          <w:b/>
-          <w:bCs/>
-          <w:color w:val="C4773B"/>
-          <w:sz w:val="20"/>
-          <w:szCs w:val="20"/>
-        </w:rPr>
-        <w:t xml:space="preserve">4.</w:t>
-      </w:r>
-      <w:r>
-        <w:t xml:space="preserve">  </w:t>
-      </w:r>
-      <w:r>
-        <w:rPr>
-          <w:sz w:val="20"/>
-          <w:szCs w:val="20"/>
-        </w:rPr>
-        <w:t xml:space="preserve">Paystack will verify it, then all future payments settle there automatically every business day</w:t>
-      </w:r>
-    </w:p>
-    <w:p>
-      <w:pPr>
-        <w:spacing w:after="120"/>
-        <w:ind w:left="360"/>
-      </w:pPr>
-      <w:r>
-        <w:rPr>
-          <w:b/>
-          <w:bCs/>
-          <w:color w:val="C4773B"/>
-          <w:sz w:val="18"/>
-          <w:szCs w:val="18"/>
-        </w:rPr>
-        <w:t xml:space="preserve">Note:  </w:t>
-      </w:r>
-      <w:r>
-        <w:rPr>
-          <w:i/>
-          <w:iCs/>
-          <w:color w:val="666666"/>
-          <w:sz w:val="18"/>
-          <w:szCs w:val="18"/>
-        </w:rPr>
-        <w:t xml:space="preserve">Once your bank account is added, you do not need to do anything — money moves on its own.</w:t>
+        <w:t xml:space="preserve">Done — settlements happen automatically from then on</w:t>
       </w:r>
     </w:p>
     <w:p>
@@ -2767,7 +2061,7 @@
           <w:sz w:val="28"/>
           <w:szCs w:val="28"/>
         </w:rPr>
-        <w:t xml:space="preserve">SECTION 6 — Emails and Notifications</w:t>
+        <w:t xml:space="preserve">SECTION 6 — Emails</w:t>
       </w:r>
     </w:p>
     <w:p>
@@ -2779,7 +2073,7 @@
           <w:sz w:val="20"/>
           <w:szCs w:val="20"/>
         </w:rPr>
-        <w:t xml:space="preserve">The store sends emails automatically — you do not need to do anything.</w:t>
+        <w:t xml:space="preserve">Emails go out automatically on every order — nothing to set up.</w:t>
       </w:r>
     </w:p>
     <w:p>
@@ -2799,19 +2093,7 @@
           <w:sz w:val="22"/>
           <w:szCs w:val="22"/>
         </w:rPr>
-        <w:t xml:space="preserve">What the Customer Receives</w:t>
-      </w:r>
-    </w:p>
-    <w:p>
-      <w:pPr>
-        <w:spacing w:after="100"/>
-      </w:pPr>
-      <w:r>
-        <w:rPr>
-          <w:sz w:val="20"/>
-          <w:szCs w:val="20"/>
-        </w:rPr>
-        <w:t xml:space="preserve">After every successful payment, the customer receives a beautiful confirmation email with:</w:t>
+        <w:t xml:space="preserve">Customer gets</w:t>
       </w:r>
     </w:p>
     <w:p>
@@ -2827,71 +2109,7 @@
           <w:sz w:val="20"/>
           <w:szCs w:val="20"/>
         </w:rPr>
-        <w:t xml:space="preserve">Their order reference number</w:t>
-      </w:r>
-    </w:p>
-    <w:p>
-      <w:pPr>
-        <w:spacing w:after="80"/>
-        <w:ind w:left="360"/>
-      </w:pPr>
-      <w:r>
-        <w:t xml:space="preserve">•  </w:t>
-      </w:r>
-      <w:r>
-        <w:rPr>
-          <w:sz w:val="20"/>
-          <w:szCs w:val="20"/>
-        </w:rPr>
-        <w:t xml:space="preserve">A full list of what they ordered with sizes and prices</w:t>
-      </w:r>
-    </w:p>
-    <w:p>
-      <w:pPr>
-        <w:spacing w:after="80"/>
-        <w:ind w:left="360"/>
-      </w:pPr>
-      <w:r>
-        <w:t xml:space="preserve">•  </w:t>
-      </w:r>
-      <w:r>
-        <w:rPr>
-          <w:sz w:val="20"/>
-          <w:szCs w:val="20"/>
-        </w:rPr>
-        <w:t xml:space="preserve">The total amount paid</w:t>
-      </w:r>
-    </w:p>
-    <w:p>
-      <w:pPr>
-        <w:spacing w:after="80"/>
-        <w:ind w:left="360"/>
-      </w:pPr>
-      <w:r>
-        <w:t xml:space="preserve">•  </w:t>
-      </w:r>
-      <w:r>
-        <w:rPr>
-          <w:sz w:val="20"/>
-          <w:szCs w:val="20"/>
-        </w:rPr>
-        <w:t xml:space="preserve">Their delivery address</w:t>
-      </w:r>
-    </w:p>
-    <w:p>
-      <w:pPr>
-        <w:spacing w:after="80"/>
-        <w:ind w:left="360"/>
-      </w:pPr>
-      <w:r>
-        <w:t xml:space="preserve">•  </w:t>
-      </w:r>
-      <w:r>
-        <w:rPr>
-          <w:sz w:val="20"/>
-          <w:szCs w:val="20"/>
-        </w:rPr>
-        <w:t xml:space="preserve">A WhatsApp button to contact you if they have questions</w:t>
+        <w:t xml:space="preserve">Order reference, items, total paid, delivery address, WhatsApp link to reach you</w:t>
       </w:r>
     </w:p>
     <w:p>
@@ -2911,19 +2129,7 @@
           <w:sz w:val="22"/>
           <w:szCs w:val="22"/>
         </w:rPr>
-        <w:t xml:space="preserve">What You Receive</w:t>
-      </w:r>
-    </w:p>
-    <w:p>
-      <w:pPr>
-        <w:spacing w:after="100"/>
-      </w:pPr>
-      <w:r>
-        <w:rPr>
-          <w:sz w:val="20"/>
-          <w:szCs w:val="20"/>
-        </w:rPr>
-        <w:t xml:space="preserve">At the same time, you (the admin) receive a notification email with:</w:t>
+        <w:t xml:space="preserve">You get</w:t>
       </w:r>
     </w:p>
     <w:p>
@@ -2939,87 +2145,7 @@
           <w:sz w:val="20"/>
           <w:szCs w:val="20"/>
         </w:rPr>
-        <w:t xml:space="preserve">The customer's full name, email address, and phone number</w:t>
-      </w:r>
-    </w:p>
-    <w:p>
-      <w:pPr>
-        <w:spacing w:after="80"/>
-        <w:ind w:left="360"/>
-      </w:pPr>
-      <w:r>
-        <w:t xml:space="preserve">•  </w:t>
-      </w:r>
-      <w:r>
-        <w:rPr>
-          <w:sz w:val="20"/>
-          <w:szCs w:val="20"/>
-        </w:rPr>
-        <w:t xml:space="preserve">Their complete delivery address</w:t>
-      </w:r>
-    </w:p>
-    <w:p>
-      <w:pPr>
-        <w:spacing w:after="80"/>
-        <w:ind w:left="360"/>
-      </w:pPr>
-      <w:r>
-        <w:t xml:space="preserve">•  </w:t>
-      </w:r>
-      <w:r>
-        <w:rPr>
-          <w:sz w:val="20"/>
-          <w:szCs w:val="20"/>
-        </w:rPr>
-        <w:t xml:space="preserve">Every item they ordered</w:t>
-      </w:r>
-    </w:p>
-    <w:p>
-      <w:pPr>
-        <w:spacing w:after="80"/>
-        <w:ind w:left="360"/>
-      </w:pPr>
-      <w:r>
-        <w:t xml:space="preserve">•  </w:t>
-      </w:r>
-      <w:r>
-        <w:rPr>
-          <w:sz w:val="20"/>
-          <w:szCs w:val="20"/>
-        </w:rPr>
-        <w:t xml:space="preserve">The total order value</w:t>
-      </w:r>
-    </w:p>
-    <w:p>
-      <w:pPr>
-        <w:spacing w:after="80"/>
-        <w:ind w:left="360"/>
-      </w:pPr>
-      <w:r>
-        <w:t xml:space="preserve">•  </w:t>
-      </w:r>
-      <w:r>
-        <w:rPr>
-          <w:sz w:val="20"/>
-          <w:szCs w:val="20"/>
-        </w:rPr>
-        <w:t xml:space="preserve">A direct link to view the order in your dashboard</w:t>
-      </w:r>
-    </w:p>
-    <w:p>
-      <w:pPr>
-        <w:spacing w:after="80"/>
-        <w:ind w:left="360"/>
-      </w:pPr>
-      <w:r>
-        <w:t xml:space="preserve">•  </w:t>
-      </w:r>
-      <w:r>
-        <w:rPr>
-          <w:sz w:val="20"/>
-          <w:szCs w:val="20"/>
-        </w:rPr>
-        <w:t xml:space="preserve">A WhatsApp button to message the customer with one click</w:t>
+        <w:t xml:space="preserve">Customer name, phone, address, items ordered, total — plus a direct link to the order and a WhatsApp button</w:t>
       </w:r>
     </w:p>
     <w:p>
@@ -3042,7 +2168,7 @@
           <w:sz w:val="28"/>
           <w:szCs w:val="28"/>
         </w:rPr>
-        <w:t xml:space="preserve">SECTION 7 — Common Things You Will Do</w:t>
+        <w:t xml:space="preserve">SECTION 7 — Quick Tasks</w:t>
       </w:r>
     </w:p>
     <w:p>
@@ -3057,127 +2183,39 @@
           <w:sz w:val="22"/>
           <w:szCs w:val="22"/>
         </w:rPr>
-        <w:t xml:space="preserve">Hide a product temporarily (e.g. it is sold out or being remade)</w:t>
-      </w:r>
-    </w:p>
-    <w:p>
-      <w:pPr>
-        <w:spacing w:after="100"/>
-        <w:ind w:left="360"/>
-      </w:pPr>
-      <w:r>
-        <w:rPr>
-          <w:b/>
-          <w:bCs/>
-          <w:color w:val="C4773B"/>
-          <w:sz w:val="20"/>
-          <w:szCs w:val="20"/>
-        </w:rPr>
-        <w:t xml:space="preserve">1.</w:t>
-      </w:r>
-      <w:r>
-        <w:t xml:space="preserve">  </w:t>
-      </w:r>
-      <w:r>
-        <w:rPr>
-          <w:sz w:val="20"/>
-          <w:szCs w:val="20"/>
-        </w:rPr>
-        <w:t xml:space="preserve">Go to Admin → Products</w:t>
-      </w:r>
-    </w:p>
-    <w:p>
-      <w:pPr>
-        <w:spacing w:after="100"/>
-        <w:ind w:left="360"/>
-      </w:pPr>
-      <w:r>
-        <w:rPr>
-          <w:b/>
-          <w:bCs/>
-          <w:color w:val="C4773B"/>
-          <w:sz w:val="20"/>
-          <w:szCs w:val="20"/>
-        </w:rPr>
-        <w:t xml:space="preserve">2.</w:t>
-      </w:r>
-      <w:r>
-        <w:t xml:space="preserve">  </w:t>
-      </w:r>
-      <w:r>
-        <w:rPr>
-          <w:sz w:val="20"/>
-          <w:szCs w:val="20"/>
-        </w:rPr>
-        <w:t xml:space="preserve">Find the product and click the pencil/edit icon</w:t>
-      </w:r>
-    </w:p>
-    <w:p>
-      <w:pPr>
-        <w:spacing w:after="100"/>
-        <w:ind w:left="360"/>
-      </w:pPr>
-      <w:r>
-        <w:rPr>
-          <w:b/>
-          <w:bCs/>
-          <w:color w:val="C4773B"/>
-          <w:sz w:val="20"/>
-          <w:szCs w:val="20"/>
-        </w:rPr>
-        <w:t xml:space="preserve">3.</w:t>
-      </w:r>
-      <w:r>
-        <w:t xml:space="preserve">  </w:t>
-      </w:r>
-      <w:r>
-        <w:rPr>
-          <w:sz w:val="20"/>
-          <w:szCs w:val="20"/>
-        </w:rPr>
-        <w:t xml:space="preserve">Untick </w:t>
-      </w:r>
-      <w:r>
-        <w:rPr>
-          <w:b/>
-          <w:bCs/>
-          <w:sz w:val="20"/>
-          <w:szCs w:val="20"/>
-        </w:rPr>
-        <w:t xml:space="preserve">'Active'</w:t>
-      </w:r>
-      <w:r>
-        <w:rPr>
-          <w:sz w:val="20"/>
-          <w:szCs w:val="20"/>
-        </w:rPr>
-        <w:t xml:space="preserve"> and click Save — it disappears from the store but is NOT deleted</w:t>
-      </w:r>
-    </w:p>
-    <w:p>
-      <w:pPr>
-        <w:spacing w:after="100"/>
-        <w:ind w:left="360"/>
-      </w:pPr>
-      <w:r>
-        <w:rPr>
-          <w:b/>
-          <w:bCs/>
-          <w:color w:val="C4773B"/>
-          <w:sz w:val="20"/>
-          <w:szCs w:val="20"/>
-        </w:rPr>
-        <w:t xml:space="preserve">4.</w:t>
-      </w:r>
-      <w:r>
-        <w:t xml:space="preserve">  </w:t>
-      </w:r>
-      <w:r>
-        <w:rPr>
-          <w:sz w:val="20"/>
-          <w:szCs w:val="20"/>
-        </w:rPr>
-        <w:t xml:space="preserve">To bring it back, edit it again and tick Active</w:t>
+        <w:t xml:space="preserve">Hide a product</w:t>
+      </w:r>
+    </w:p>
+    <w:p>
+      <w:pPr>
+        <w:spacing w:after="80"/>
+        <w:ind w:left="360"/>
+      </w:pPr>
+      <w:r>
+        <w:t xml:space="preserve">•  </w:t>
+      </w:r>
+      <w:r>
+        <w:rPr>
+          <w:sz w:val="20"/>
+          <w:szCs w:val="20"/>
+        </w:rPr>
+        <w:t xml:space="preserve">Admin → Products → Edit → untick </w:t>
+      </w:r>
+      <w:r>
+        <w:rPr>
+          <w:b/>
+          <w:bCs/>
+          <w:sz w:val="20"/>
+          <w:szCs w:val="20"/>
+        </w:rPr>
+        <w:t xml:space="preserve">Active</w:t>
+      </w:r>
+      <w:r>
+        <w:rPr>
+          <w:sz w:val="20"/>
+          <w:szCs w:val="20"/>
+        </w:rPr>
+        <w:t xml:space="preserve"> → Save. Not deleted, just hidden.</w:t>
       </w:r>
     </w:p>
     <w:p>
@@ -3197,101 +2235,23 @@
           <w:sz w:val="22"/>
           <w:szCs w:val="22"/>
         </w:rPr>
-        <w:t xml:space="preserve">Update stock when you make more pieces</w:t>
-      </w:r>
-    </w:p>
-    <w:p>
-      <w:pPr>
-        <w:spacing w:after="100"/>
-        <w:ind w:left="360"/>
-      </w:pPr>
-      <w:r>
-        <w:rPr>
-          <w:b/>
-          <w:bCs/>
-          <w:color w:val="C4773B"/>
-          <w:sz w:val="20"/>
-          <w:szCs w:val="20"/>
-        </w:rPr>
-        <w:t xml:space="preserve">1.</w:t>
-      </w:r>
-      <w:r>
-        <w:t xml:space="preserve">  </w:t>
-      </w:r>
-      <w:r>
-        <w:rPr>
-          <w:sz w:val="20"/>
-          <w:szCs w:val="20"/>
-        </w:rPr>
-        <w:t xml:space="preserve">Go to Admin → Products → Edit the product</w:t>
-      </w:r>
-    </w:p>
-    <w:p>
-      <w:pPr>
-        <w:spacing w:after="100"/>
-        <w:ind w:left="360"/>
-      </w:pPr>
-      <w:r>
-        <w:rPr>
-          <w:b/>
-          <w:bCs/>
-          <w:color w:val="C4773B"/>
-          <w:sz w:val="20"/>
-          <w:szCs w:val="20"/>
-        </w:rPr>
-        <w:t xml:space="preserve">2.</w:t>
-      </w:r>
-      <w:r>
-        <w:t xml:space="preserve">  </w:t>
-      </w:r>
-      <w:r>
-        <w:rPr>
-          <w:sz w:val="20"/>
-          <w:szCs w:val="20"/>
-        </w:rPr>
-        <w:t xml:space="preserve">Change the </w:t>
-      </w:r>
-      <w:r>
-        <w:rPr>
-          <w:b/>
-          <w:bCs/>
-          <w:sz w:val="20"/>
-          <w:szCs w:val="20"/>
-        </w:rPr>
-        <w:t xml:space="preserve">Stock</w:t>
-      </w:r>
-      <w:r>
-        <w:rPr>
-          <w:sz w:val="20"/>
-          <w:szCs w:val="20"/>
-        </w:rPr>
-        <w:t xml:space="preserve"> number to the new quantity</w:t>
-      </w:r>
-    </w:p>
-    <w:p>
-      <w:pPr>
-        <w:spacing w:after="100"/>
-        <w:ind w:left="360"/>
-      </w:pPr>
-      <w:r>
-        <w:rPr>
-          <w:b/>
-          <w:bCs/>
-          <w:color w:val="C4773B"/>
-          <w:sz w:val="20"/>
-          <w:szCs w:val="20"/>
-        </w:rPr>
-        <w:t xml:space="preserve">3.</w:t>
-      </w:r>
-      <w:r>
-        <w:t xml:space="preserve">  </w:t>
-      </w:r>
-      <w:r>
-        <w:rPr>
-          <w:sz w:val="20"/>
-          <w:szCs w:val="20"/>
-        </w:rPr>
-        <w:t xml:space="preserve">Click Save</w:t>
+        <w:t xml:space="preserve">Update stock</w:t>
+      </w:r>
+    </w:p>
+    <w:p>
+      <w:pPr>
+        <w:spacing w:after="80"/>
+        <w:ind w:left="360"/>
+      </w:pPr>
+      <w:r>
+        <w:t xml:space="preserve">•  </w:t>
+      </w:r>
+      <w:r>
+        <w:rPr>
+          <w:sz w:val="20"/>
+          <w:szCs w:val="20"/>
+        </w:rPr>
+        <w:t xml:space="preserve">Admin → Products → Edit → change the Stock number → Save</w:t>
       </w:r>
     </w:p>
     <w:p>
@@ -3311,68 +2271,23 @@
           <w:sz w:val="22"/>
           <w:szCs w:val="22"/>
         </w:rPr>
-        <w:t xml:space="preserve">Add a new category</w:t>
-      </w:r>
-    </w:p>
-    <w:p>
-      <w:pPr>
-        <w:spacing w:after="100"/>
-        <w:ind w:left="360"/>
-      </w:pPr>
-      <w:r>
-        <w:rPr>
-          <w:b/>
-          <w:bCs/>
-          <w:color w:val="C4773B"/>
-          <w:sz w:val="20"/>
-          <w:szCs w:val="20"/>
-        </w:rPr>
-        <w:t xml:space="preserve">1.</w:t>
-      </w:r>
-      <w:r>
-        <w:t xml:space="preserve">  </w:t>
-      </w:r>
-      <w:r>
-        <w:rPr>
-          <w:sz w:val="20"/>
-          <w:szCs w:val="20"/>
-        </w:rPr>
-        <w:t xml:space="preserve">Go to Admin → Categories</w:t>
-      </w:r>
-    </w:p>
-    <w:p>
-      <w:pPr>
-        <w:spacing w:after="100"/>
-        <w:ind w:left="360"/>
-      </w:pPr>
-      <w:r>
-        <w:rPr>
-          <w:b/>
-          <w:bCs/>
-          <w:color w:val="C4773B"/>
-          <w:sz w:val="20"/>
-          <w:szCs w:val="20"/>
-        </w:rPr>
-        <w:t xml:space="preserve">2.</w:t>
-      </w:r>
-      <w:r>
-        <w:t xml:space="preserve">  </w:t>
-      </w:r>
-      <w:r>
-        <w:rPr>
-          <w:sz w:val="20"/>
-          <w:szCs w:val="20"/>
-        </w:rPr>
-        <w:t xml:space="preserve">Type the new category name in the box and click </w:t>
-      </w:r>
-      <w:r>
-        <w:rPr>
-          <w:b/>
-          <w:bCs/>
-          <w:sz w:val="20"/>
-          <w:szCs w:val="20"/>
-        </w:rPr>
-        <w:t xml:space="preserve">'Add'</w:t>
+        <w:t xml:space="preserve">Change a price</w:t>
+      </w:r>
+    </w:p>
+    <w:p>
+      <w:pPr>
+        <w:spacing w:after="80"/>
+        <w:ind w:left="360"/>
+      </w:pPr>
+      <w:r>
+        <w:t xml:space="preserve">•  </w:t>
+      </w:r>
+      <w:r>
+        <w:rPr>
+          <w:sz w:val="20"/>
+          <w:szCs w:val="20"/>
+        </w:rPr>
+        <w:t xml:space="preserve">Admin → Products → Edit → update Price → Save</w:t>
       </w:r>
     </w:p>
     <w:p>
@@ -3392,59 +2307,23 @@
           <w:sz w:val="22"/>
           <w:szCs w:val="22"/>
         </w:rPr>
-        <w:t xml:space="preserve">Change a product's price</w:t>
-      </w:r>
-    </w:p>
-    <w:p>
-      <w:pPr>
-        <w:spacing w:after="100"/>
-        <w:ind w:left="360"/>
-      </w:pPr>
-      <w:r>
-        <w:rPr>
-          <w:b/>
-          <w:bCs/>
-          <w:color w:val="C4773B"/>
-          <w:sz w:val="20"/>
-          <w:szCs w:val="20"/>
-        </w:rPr>
-        <w:t xml:space="preserve">1.</w:t>
-      </w:r>
-      <w:r>
-        <w:t xml:space="preserve">  </w:t>
-      </w:r>
-      <w:r>
-        <w:rPr>
-          <w:sz w:val="20"/>
-          <w:szCs w:val="20"/>
-        </w:rPr>
-        <w:t xml:space="preserve">Go to Admin → Products → Edit the product</w:t>
-      </w:r>
-    </w:p>
-    <w:p>
-      <w:pPr>
-        <w:spacing w:after="100"/>
-        <w:ind w:left="360"/>
-      </w:pPr>
-      <w:r>
-        <w:rPr>
-          <w:b/>
-          <w:bCs/>
-          <w:color w:val="C4773B"/>
-          <w:sz w:val="20"/>
-          <w:szCs w:val="20"/>
-        </w:rPr>
-        <w:t xml:space="preserve">2.</w:t>
-      </w:r>
-      <w:r>
-        <w:t xml:space="preserve">  </w:t>
-      </w:r>
-      <w:r>
-        <w:rPr>
-          <w:sz w:val="20"/>
-          <w:szCs w:val="20"/>
-        </w:rPr>
-        <w:t xml:space="preserve">Change the Price number and click Save — the new price shows immediately</w:t>
+        <w:t xml:space="preserve">Add a category</w:t>
+      </w:r>
+    </w:p>
+    <w:p>
+      <w:pPr>
+        <w:spacing w:after="80"/>
+        <w:ind w:left="360"/>
+      </w:pPr>
+      <w:r>
+        <w:t xml:space="preserve">•  </w:t>
+      </w:r>
+      <w:r>
+        <w:rPr>
+          <w:sz w:val="20"/>
+          <w:szCs w:val="20"/>
+        </w:rPr>
+        <w:t xml:space="preserve">Admin → Categories → type name → click Add</w:t>
       </w:r>
     </w:p>
     <w:p>
@@ -3467,7 +2346,7 @@
           <w:sz w:val="28"/>
           <w:szCs w:val="28"/>
         </w:rPr>
-        <w:t xml:space="preserve">SECTION 8 — If Something Goes Wrong</w:t>
+        <w:t xml:space="preserve">SECTION 8 — Troubleshooting</w:t>
       </w:r>
     </w:p>
     <w:p>
@@ -3482,7 +2361,7 @@
           <w:sz w:val="22"/>
           <w:szCs w:val="22"/>
         </w:rPr>
-        <w:t xml:space="preserve">'I cannot log in'</w:t>
+        <w:t xml:space="preserve">Can't log in</w:t>
       </w:r>
     </w:p>
     <w:p>
@@ -3498,7 +2377,7 @@
           <w:sz w:val="20"/>
           <w:szCs w:val="20"/>
         </w:rPr>
-        <w:t xml:space="preserve">Make sure you are visiting </w:t>
+        <w:t xml:space="preserve">Make sure you're on </w:t>
       </w:r>
       <w:r>
         <w:rPr>
@@ -3514,7 +2393,7 @@
           <w:sz w:val="20"/>
           <w:szCs w:val="20"/>
         </w:rPr>
-        <w:t xml:space="preserve"> — not the shop page</w:t>
+        <w:t xml:space="preserve">, not the shop</w:t>
       </w:r>
     </w:p>
     <w:p>
@@ -3530,7 +2409,7 @@
           <w:sz w:val="20"/>
           <w:szCs w:val="20"/>
         </w:rPr>
-        <w:t xml:space="preserve">Check your email and password are typed correctly (password is: </w:t>
+        <w:t xml:space="preserve">Password is </w:t>
       </w:r>
       <w:r>
         <w:rPr>
@@ -3542,13 +2421,6 @@
         </w:rPr>
         <w:t xml:space="preserve">Password@123</w:t>
       </w:r>
-      <w:r>
-        <w:rPr>
-          <w:sz w:val="20"/>
-          <w:szCs w:val="20"/>
-        </w:rPr>
-        <w:t xml:space="preserve">)</w:t>
-      </w:r>
     </w:p>
     <w:p>
       <w:pPr>
@@ -3563,23 +2435,7 @@
           <w:sz w:val="20"/>
           <w:szCs w:val="20"/>
         </w:rPr>
-        <w:t xml:space="preserve">Try opening it in a different browser or on a different phone</w:t>
-      </w:r>
-    </w:p>
-    <w:p>
-      <w:pPr>
-        <w:spacing w:after="80"/>
-        <w:ind w:left="360"/>
-      </w:pPr>
-      <w:r>
-        <w:t xml:space="preserve">•  </w:t>
-      </w:r>
-      <w:r>
-        <w:rPr>
-          <w:sz w:val="20"/>
-          <w:szCs w:val="20"/>
-        </w:rPr>
-        <w:t xml:space="preserve">If still not working, call Abdulazeez</w:t>
+        <w:t xml:space="preserve">Try a different browser or phone — if still stuck, call Abdulazeez</w:t>
       </w:r>
     </w:p>
     <w:p>
@@ -3599,7 +2455,7 @@
           <w:sz w:val="22"/>
           <w:szCs w:val="22"/>
         </w:rPr>
-        <w:t xml:space="preserve">'A product is showing Sold Out but I have stock'</w:t>
+        <w:t xml:space="preserve">Product shows Sold Out but you have stock</w:t>
       </w:r>
     </w:p>
     <w:p>
@@ -3615,7 +2471,7 @@
           <w:sz w:val="20"/>
           <w:szCs w:val="20"/>
         </w:rPr>
-        <w:t xml:space="preserve">Go to Admin → Products → Edit the product → update the Stock number → Save</w:t>
+        <w:t xml:space="preserve">Admin → Products → Edit → update Stock number → Save</w:t>
       </w:r>
     </w:p>
     <w:p>
@@ -3635,7 +2491,7 @@
           <w:sz w:val="22"/>
           <w:szCs w:val="22"/>
         </w:rPr>
-        <w:t xml:space="preserve">'A customer says they paid but I cannot see the order'</w:t>
+        <w:t xml:space="preserve">Customer paid but order isn't showing</w:t>
       </w:r>
     </w:p>
     <w:p>
@@ -3651,7 +2507,7 @@
           <w:sz w:val="20"/>
           <w:szCs w:val="20"/>
         </w:rPr>
-        <w:t xml:space="preserve">Go to Admin → Orders — scroll down or check the next page</w:t>
+        <w:t xml:space="preserve">Check Admin → Orders (scroll down or go to next page)</w:t>
       </w:r>
     </w:p>
     <w:p>
@@ -3667,23 +2523,7 @@
           <w:sz w:val="20"/>
           <w:szCs w:val="20"/>
         </w:rPr>
-        <w:t xml:space="preserve">Log into Paystack to confirm the payment came through</w:t>
-      </w:r>
-    </w:p>
-    <w:p>
-      <w:pPr>
-        <w:spacing w:after="80"/>
-        <w:ind w:left="360"/>
-      </w:pPr>
-      <w:r>
-        <w:t xml:space="preserve">•  </w:t>
-      </w:r>
-      <w:r>
-        <w:rPr>
-          <w:sz w:val="20"/>
-          <w:szCs w:val="20"/>
-        </w:rPr>
-        <w:t xml:space="preserve">Contact Abdulazeez with the customer's name and payment amount</w:t>
+        <w:t xml:space="preserve">Check Paystack to confirm payment — then call Abdulazeez with the reference</w:t>
       </w:r>
     </w:p>
     <w:p>
@@ -3703,7 +2543,7 @@
           <w:sz w:val="22"/>
           <w:szCs w:val="22"/>
         </w:rPr>
-        <w:t xml:space="preserve">'The store is not opening / something looks broken'</w:t>
+        <w:t xml:space="preserve">Store looks broken or won't open</w:t>
       </w:r>
     </w:p>
     <w:p>
@@ -3719,7 +2559,7 @@
           <w:sz w:val="20"/>
           <w:szCs w:val="20"/>
         </w:rPr>
-        <w:t xml:space="preserve">Try refreshing the page (pull down on your phone)</w:t>
+        <w:t xml:space="preserve">Pull down to refresh on your phone</w:t>
       </w:r>
     </w:p>
     <w:p>
@@ -3735,7 +2575,7 @@
           <w:sz w:val="20"/>
           <w:szCs w:val="20"/>
         </w:rPr>
-        <w:t xml:space="preserve">Try opening it on a different network (switch from WiFi to mobile data or vice versa)</w:t>
+        <w:t xml:space="preserve">Switch between WiFi and mobile data</w:t>
       </w:r>
     </w:p>
     <w:p>
@@ -3751,7 +2591,7 @@
           <w:sz w:val="20"/>
           <w:szCs w:val="20"/>
         </w:rPr>
-        <w:t xml:space="preserve">If the problem continues, contact Abdulazeez immediately</w:t>
+        <w:t xml:space="preserve">If it continues, call Abdulazeez</w:t>
       </w:r>
     </w:p>
     <w:p>

</xml_diff>